<commit_message>
Add the grading and late work policy
The updated Syllabus Policy document adds submission, late work and
grading sections. These are now a sixth tab on Course Policies, placed
before the AI policy: the grading scale as a table, what is assessed and
at what weight, how work is submitted through Canvas and tracked in
Focus, the late penalties, what happens after an excused absence, and how
completion grades differ.

The late penalties are set out as their own block, since the step from a
10% deduction to a zero at five days is the part students most need to
see clearly.

The plagiarism zero-grade line on the academic integrity tab now points
across to this tab, so the two places a student can lose a whole grade
are connected rather than sitting apart.

The updated source document replaces the earlier copy in docs/.

Co-Authored-By: Claude Opus 5 <noreply@anthropic.com>
</commit_message>
<xml_diff>
--- a/docs/Syllabus Policy.docx
+++ b/docs/Syllabus Policy.docx
@@ -1,6 +1,6 @@
 
 <file path=word/document.xml><?xml version="1.0" encoding="utf-8"?>
-<w:document xmlns:wpc="http://schemas.microsoft.com/office/word/2010/wordprocessingCanvas" xmlns:cx="http://schemas.microsoft.com/office/drawing/2014/chartex" xmlns:cx1="http://schemas.microsoft.com/office/drawing/2015/9/8/chartex" xmlns:cx2="http://schemas.microsoft.com/office/drawing/2015/10/21/chartex" xmlns:cx3="http://schemas.microsoft.com/office/drawing/2016/5/9/chartex" xmlns:cx4="http://schemas.microsoft.com/office/drawing/2016/5/10/chartex" xmlns:cx5="http://schemas.microsoft.com/office/drawing/2016/5/11/chartex" xmlns:cx6="http://schemas.microsoft.com/office/drawing/2016/5/12/chartex" xmlns:cx7="http://schemas.microsoft.com/office/drawing/2016/5/13/chartex" xmlns:cx8="http://schemas.microsoft.com/office/drawing/2016/5/14/chartex" xmlns:mc="http://schemas.openxmlformats.org/markup-compatibility/2006" xmlns:aink="http://schemas.microsoft.com/office/drawing/2016/ink" xmlns:am3d="http://schemas.microsoft.com/office/drawing/2017/model3d" xmlns:o="urn:schemas-microsoft-com:office:office" xmlns:oel="http://schemas.microsoft.com/office/2019/extlst" xmlns:r="http://schemas.openxmlformats.org/officeDocument/2006/relationships" xmlns:m="http://schemas.openxmlformats.org/officeDocument/2006/math" xmlns:v="urn:schemas-microsoft-com:vml" xmlns:wp14="http://schemas.microsoft.com/office/word/2010/wordprocessingDrawing" xmlns:wp="http://schemas.openxmlformats.org/drawingml/2006/wordprocessingDrawing" xmlns:w10="urn:schemas-microsoft-com:office:word" xmlns:w="http://schemas.openxmlformats.org/wordprocessingml/2006/main" xmlns:w14="http://schemas.microsoft.com/office/word/2010/wordml" xmlns:w15="http://schemas.microsoft.com/office/word/2012/wordml" xmlns:w16cex="http://schemas.microsoft.com/office/word/2018/wordml/cex" xmlns:w16cid="http://schemas.microsoft.com/office/word/2016/wordml/cid" xmlns:w16="http://schemas.microsoft.com/office/word/2018/wordml" xmlns:w16du="http://schemas.microsoft.com/office/word/2023/wordml/word16du" xmlns:w16sdtdh="http://schemas.microsoft.com/office/word/2020/wordml/sdtdatahash" xmlns:w16sdtfl="http://schemas.microsoft.com/office/word/2024/wordml/sdtformatlock" xmlns:w16se="http://schemas.microsoft.com/office/word/2015/wordml/symex" xmlns:wpg="http://schemas.microsoft.com/office/word/2010/wordprocessingGroup" xmlns:wpi="http://schemas.microsoft.com/office/word/2010/wordprocessingInk" xmlns:wne="http://schemas.microsoft.com/office/word/2006/wordml" xmlns:wps="http://schemas.microsoft.com/office/word/2010/wordprocessingShape" mc:Ignorable="w14 w15 w16se w16cid w16 w16cex w16sdtdh w16sdtfl w16du wp14">
+<w:document xmlns:wpc="http://schemas.microsoft.com/office/word/2010/wordprocessingCanvas" xmlns:cx="http://schemas.microsoft.com/office/drawing/2014/chartex" xmlns:cx1="http://schemas.microsoft.com/office/drawing/2015/9/8/chartex" xmlns:cx2="http://schemas.microsoft.com/office/drawing/2015/10/21/chartex" xmlns:cx3="http://schemas.microsoft.com/office/drawing/2016/5/9/chartex" xmlns:cx4="http://schemas.microsoft.com/office/drawing/2016/5/10/chartex" xmlns:cx5="http://schemas.microsoft.com/office/drawing/2016/5/11/chartex" xmlns:cx6="http://schemas.microsoft.com/office/drawing/2016/5/12/chartex" xmlns:cx7="http://schemas.microsoft.com/office/drawing/2016/5/13/chartex" xmlns:cx8="http://schemas.microsoft.com/office/drawing/2016/5/14/chartex" xmlns:mc="http://schemas.openxmlformats.org/markup-compatibility/2006" xmlns:m="http://schemas.openxmlformats.org/officeDocument/2006/math" xmlns:aink="http://schemas.microsoft.com/office/drawing/2016/ink" xmlns:am3d="http://schemas.microsoft.com/office/drawing/2017/model3d" xmlns:oel="http://schemas.microsoft.com/office/2019/extlst" xmlns:r="http://schemas.openxmlformats.org/officeDocument/2006/relationships" xmlns:wp14="http://schemas.microsoft.com/office/word/2010/wordprocessingDrawing" xmlns:wp="http://schemas.openxmlformats.org/drawingml/2006/wordprocessingDrawing" xmlns:wpg="http://schemas.microsoft.com/office/word/2010/wordprocessingGroup" xmlns:wpi="http://schemas.microsoft.com/office/word/2010/wordprocessingInk" xmlns:wps="http://schemas.microsoft.com/office/word/2010/wordprocessingShape" xmlns:o="urn:schemas-microsoft-com:office:office" xmlns:v="urn:schemas-microsoft-com:vml" xmlns:w10="urn:schemas-microsoft-com:office:word" xmlns:w="http://schemas.openxmlformats.org/wordprocessingml/2006/main" xmlns:w14="http://schemas.microsoft.com/office/word/2010/wordml" xmlns:w15="http://schemas.microsoft.com/office/word/2012/wordml" xmlns:w16cei="http://schemas.microsoft.com/office/word/2026/wordml/cei" xmlns:w16cex="http://schemas.microsoft.com/office/word/2018/wordml/cex" xmlns:w16cid="http://schemas.microsoft.com/office/word/2016/wordml/cid" xmlns:w16="http://schemas.microsoft.com/office/word/2018/wordml" xmlns:w16sdtdh="http://schemas.microsoft.com/office/word/2020/wordml/sdtdatahash" xmlns:w16sdtfl="http://schemas.microsoft.com/office/word/2024/wordml/sdtformatlock" xmlns:w16se="http://schemas.microsoft.com/office/word/2015/wordml/symex" xmlns:w16du="http://schemas.microsoft.com/office/word/2023/wordml/word16du" xmlns:wne="http://schemas.microsoft.com/office/word/2006/wordml" mc:Ignorable="w14 w15 w16se w16cid w16 w16cex w16sdtdh w16sdtfl w16du wp14">
   <w:body>
     <w:p>
       <w:pPr>
@@ -326,37 +326,7 @@
                 <w:szCs w:val="24"/>
                 <w:u w:val="single"/>
               </w:rPr>
-              <w:t>Hence, students will be required to make short presentations (</w:t>
-            </w:r>
-            <w:proofErr w:type="gramStart"/>
-            <w:r>
-              <w:rPr>
-                <w:rFonts w:ascii="Arial Narrow" w:eastAsia="Times New Roman" w:hAnsi="Arial Narrow" w:cs="Times New Roman"/>
-                <w:b/>
-                <w:bCs/>
-                <w:i/>
-                <w:iCs/>
-                <w:color w:val="000000"/>
-                <w:sz w:val="24"/>
-                <w:szCs w:val="24"/>
-                <w:u w:val="single"/>
-              </w:rPr>
-              <w:t>accommodations</w:t>
-            </w:r>
-            <w:proofErr w:type="gramEnd"/>
-            <w:r>
-              <w:rPr>
-                <w:rFonts w:ascii="Arial Narrow" w:eastAsia="Times New Roman" w:hAnsi="Arial Narrow" w:cs="Times New Roman"/>
-                <w:b/>
-                <w:bCs/>
-                <w:i/>
-                <w:iCs/>
-                <w:color w:val="000000"/>
-                <w:sz w:val="24"/>
-                <w:szCs w:val="24"/>
-                <w:u w:val="single"/>
-              </w:rPr>
-              <w:t xml:space="preserve"> will be </w:t>
+              <w:t xml:space="preserve">Hence, students will be required to make short presentations (accommodations will be </w:t>
             </w:r>
             <w:r>
               <w:rPr>
@@ -867,7 +837,6 @@
         </w:rPr>
         <w:t xml:space="preserve">Please note that there is a state and district curriculum we must follow, and all readings are </w:t>
       </w:r>
-      <w:proofErr w:type="gramStart"/>
       <w:r>
         <w:rPr>
           <w:rFonts w:ascii="Arial Narrow" w:eastAsia="Times New Roman" w:hAnsi="Arial Narrow" w:cs="Times New Roman"/>
@@ -879,7 +848,6 @@
         </w:rPr>
         <w:t>state-approved</w:t>
       </w:r>
-      <w:proofErr w:type="gramEnd"/>
       <w:r>
         <w:rPr>
           <w:rFonts w:ascii="Arial Narrow" w:eastAsia="Times New Roman" w:hAnsi="Arial Narrow" w:cs="Times New Roman"/>
@@ -951,12 +919,15 @@
       </w:pPr>
       <w:r>
         <w:rPr>
-          <w:rFonts w:ascii="Arial Narrow" w:eastAsia="Times New Roman" w:hAnsi="Arial Narrow" w:cs="Times New Roman"/>
-          <w:sz w:val="24"/>
-          <w:szCs w:val="24"/>
+          <w:noProof/>
         </w:rPr>
-        <w:pict w14:anchorId="4C4064D8">
-          <v:rect id="_x0000_i1025" style="width:499.4pt;height:.05pt" o:hrpct="965" o:hralign="center" o:hrstd="t" o:hr="t" fillcolor="#a0a0a0" stroked="f"/>
+      </w:r>
+      <w:r>
+        <w:pict w14:anchorId="6734B46C">
+          <v:rect id="Horizontal Line 1" o:spid="_x0000_s1026" style="width:451.6pt;height:.05pt;visibility:visible;mso-wrap-style:square;mso-left-percent:-10001;mso-top-percent:-10001;mso-position-horizontal:absolute;mso-position-horizontal-relative:char;mso-position-vertical:absolute;mso-position-vertical-relative:line;mso-left-percent:-10001;mso-top-percent:-10001;v-text-anchor:top" o:gfxdata="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" filled="f">
+            <o:lock v:ext="edit" rotation="t" aspectratio="t" verticies="t" text="t" shapetype="t"/>
+            <w10:anchorlock/>
+          </v:rect>
         </w:pict>
       </w:r>
     </w:p>
@@ -1086,31 +1057,7 @@
                 <w:sz w:val="24"/>
                 <w:szCs w:val="24"/>
               </w:rPr>
-              <w:t xml:space="preserve">, must place their device in their book bags </w:t>
-            </w:r>
-            <w:proofErr w:type="gramStart"/>
-            <w:r>
-              <w:rPr>
-                <w:rFonts w:ascii="Arial Narrow" w:eastAsia="Times New Roman" w:hAnsi="Arial Narrow" w:cs="Times New Roman"/>
-                <w:b w:val="0"/>
-                <w:bCs w:val="0"/>
-                <w:color w:val="auto"/>
-                <w:sz w:val="24"/>
-                <w:szCs w:val="24"/>
-              </w:rPr>
-              <w:t>either on</w:t>
-            </w:r>
-            <w:proofErr w:type="gramEnd"/>
-            <w:r>
-              <w:rPr>
-                <w:rFonts w:ascii="Arial Narrow" w:eastAsia="Times New Roman" w:hAnsi="Arial Narrow" w:cs="Times New Roman"/>
-                <w:b w:val="0"/>
-                <w:bCs w:val="0"/>
-                <w:color w:val="auto"/>
-                <w:sz w:val="24"/>
-                <w:szCs w:val="24"/>
-              </w:rPr>
-              <w:t xml:space="preserve"> silent or off mode. Any unauthorized use of any/</w:t>
+              <w:t>, must place their device in their book bags either on silent or off mode. Any unauthorized use of any/</w:t>
             </w:r>
             <w:r>
               <w:rPr>
@@ -1324,7 +1271,6 @@
               </w:rPr>
               <w:t xml:space="preserve">upon entering the classroom, the student </w:t>
             </w:r>
-            <w:proofErr w:type="gramStart"/>
             <w:r>
               <w:rPr>
                 <w:rFonts w:ascii="Arial Narrow" w:eastAsia="Times New Roman" w:hAnsi="Arial Narrow" w:cs="Times New Roman"/>
@@ -1334,7 +1280,6 @@
               </w:rPr>
               <w:t>remove</w:t>
             </w:r>
-            <w:proofErr w:type="gramEnd"/>
             <w:r>
               <w:rPr>
                 <w:rFonts w:ascii="Arial Narrow" w:eastAsia="Times New Roman" w:hAnsi="Arial Narrow" w:cs="Times New Roman"/>
@@ -1874,21 +1819,8 @@
                 <w:sz w:val="24"/>
                 <w:szCs w:val="24"/>
               </w:rPr>
-              <w:t xml:space="preserve">Use of AI </w:t>
-            </w:r>
-            <w:proofErr w:type="gramStart"/>
-            <w:r>
-              <w:rPr>
-                <w:rFonts w:ascii="Arial Narrow" w:eastAsia="Times New Roman" w:hAnsi="Arial Narrow" w:cs="Times New Roman"/>
-                <w:b/>
-                <w:bCs/>
-                <w:color w:val="auto"/>
-                <w:sz w:val="24"/>
-                <w:szCs w:val="24"/>
-              </w:rPr>
-              <w:t>prohibited</w:t>
-            </w:r>
-            <w:proofErr w:type="gramEnd"/>
+              <w:t>Use of AI prohibited</w:t>
+            </w:r>
             <w:r>
               <w:rPr>
                 <w:rFonts w:ascii="Arial Narrow" w:eastAsia="Times New Roman" w:hAnsi="Arial Narrow" w:cs="Times New Roman"/>
@@ -1993,27 +1925,7 @@
                 <w:szCs w:val="24"/>
               </w:rPr>
               <w:lastRenderedPageBreak/>
-              <w:t xml:space="preserve">“Copilot. Accessed 2023-12-03. </w:t>
-            </w:r>
-            <w:proofErr w:type="gramStart"/>
-            <w:r>
-              <w:rPr>
-                <w:rFonts w:ascii="Arial Narrow" w:eastAsia="Times New Roman" w:hAnsi="Arial Narrow" w:cs="Times New Roman"/>
-                <w:color w:val="auto"/>
-                <w:sz w:val="24"/>
-                <w:szCs w:val="24"/>
-              </w:rPr>
-              <w:t>Prompt: ‘</w:t>
-            </w:r>
-            <w:proofErr w:type="gramEnd"/>
-            <w:r>
-              <w:rPr>
-                <w:rFonts w:ascii="Arial Narrow" w:eastAsia="Times New Roman" w:hAnsi="Arial Narrow" w:cs="Times New Roman"/>
-                <w:color w:val="auto"/>
-                <w:sz w:val="24"/>
-                <w:szCs w:val="24"/>
-              </w:rPr>
-              <w:t>Summarize the Geneva Convention in 50 words.’ Generated using Copilot-Web”</w:t>
+              <w:t>“Copilot. Accessed 2023-12-03. Prompt: ‘Summarize the Geneva Convention in 50 words.’ Generated using Copilot-Web”</w:t>
             </w:r>
           </w:p>
           <w:p>
@@ -2097,6 +2009,128 @@
       </w:tr>
     </w:tbl>
     <w:p/>
+    <w:p>
+      <w:r>
+        <w:t>ASSIGNMENT SUBMISSION &amp; LATE WORK POLICIES </w:t>
+      </w:r>
+    </w:p>
+    <w:p>
+      <w:r>
+        <w:t>Assignments &amp; Late Submissions </w:t>
+      </w:r>
+    </w:p>
+    <w:p>
+      <w:r>
+        <w:t>All assignments will be submitted on the posted due date via Canvas or through another medium as specified. </w:t>
+      </w:r>
+    </w:p>
+    <w:p>
+      <w:r>
+        <w:t>(1 Day Late): 10% off total grade, 10% added per day late after that. </w:t>
+      </w:r>
+    </w:p>
+    <w:p>
+      <w:r>
+        <w:t>Major Assignments (after 5 days late): The assignment will be returned with feedback, but with 0% of the </w:t>
+      </w:r>
+    </w:p>
+    <w:p>
+      <w:r>
+        <w:t>total grade. DO NOT BE LATE! </w:t>
+      </w:r>
+    </w:p>
+    <w:p>
+      <w:r>
+        <w:t>All students, upon an EXCUSED ABSENCE WITHIN THE POLIICY GUIDELINES IN THE PARENT/STUDENT HANDBOOK, are responsible for completing missed work assignments. Work should be submitted one day after their absence date. The following resources are good for getting missed assignments: </w:t>
+      </w:r>
+    </w:p>
+    <w:p>
+      <w:r>
+        <w:t>CANVAS </w:t>
+      </w:r>
+    </w:p>
+    <w:p>
+      <w:r>
+        <w:t>Canvas will be the main source to access all lessons and assignments. Should another forum be used, students will be notified immediately. </w:t>
+      </w:r>
+    </w:p>
+    <w:p>
+      <w:r>
+        <w:t>FOCUS </w:t>
+      </w:r>
+    </w:p>
+    <w:p>
+      <w:r>
+        <w:t>Focus will continue to be used as the main gradebook source. I will also provide annotations for any student business as a form of communication to the parents. </w:t>
+      </w:r>
+    </w:p>
+    <w:p>
+      <w:r>
+        <w:t>--- </w:t>
+      </w:r>
+    </w:p>
+    <w:p>
+      <w:r>
+        <w:t>GRADING &amp; ASSESSMENTS </w:t>
+      </w:r>
+    </w:p>
+    <w:p>
+      <w:r>
+        <w:t>--- </w:t>
+      </w:r>
+    </w:p>
+    <w:p>
+      <w:r>
+        <w:t>GRADING ASSESSMENTS </w:t>
+      </w:r>
+    </w:p>
+    <w:p>
+      <w:r>
+        <w:t>90-100% = A </w:t>
+      </w:r>
+    </w:p>
+    <w:p>
+      <w:r>
+        <w:t>80-89% = B </w:t>
+      </w:r>
+    </w:p>
+    <w:p>
+      <w:r>
+        <w:t>70-79% = C </w:t>
+      </w:r>
+    </w:p>
+    <w:p>
+      <w:r>
+        <w:t>60-69% = D </w:t>
+      </w:r>
+    </w:p>
+    <w:p>
+      <w:r>
+        <w:lastRenderedPageBreak/>
+        <w:t>50-59% = F Assessments = 100% · Presentations 100 pts · Written Assignments 100 pts · Student Profile Portfolio 100pts </w:t>
+      </w:r>
+    </w:p>
+    <w:p>
+      <w:r>
+        <w:t>COMPLETION GRADES </w:t>
+      </w:r>
+    </w:p>
+    <w:p>
+      <w:r>
+        <w:t>Completion grades will not be remediated nor adhere to the late policy, given that a full grade is given when the </w:t>
+      </w:r>
+    </w:p>
+    <w:p>
+      <w:r>
+        <w:t>work is done. Only parental notification via ParentSquare will allow the student to submit the assignment without </w:t>
+      </w:r>
+    </w:p>
+    <w:p>
+      <w:r>
+        <w:t>penalty.</w:t>
+      </w:r>
+    </w:p>
+    <w:p/>
     <w:sectPr>
       <w:pgSz w:w="12240" w:h="15840"/>
       <w:pgMar w:top="1440" w:right="1440" w:bottom="1440" w:left="1440" w:header="720" w:footer="720" w:gutter="0"/>
@@ -2108,7 +2142,7 @@
 </file>
 
 <file path=word/numbering.xml><?xml version="1.0" encoding="utf-8"?>
-<w:numbering xmlns:wpc="http://schemas.microsoft.com/office/word/2010/wordprocessingCanvas" xmlns:cx="http://schemas.microsoft.com/office/drawing/2014/chartex" xmlns:cx1="http://schemas.microsoft.com/office/drawing/2015/9/8/chartex" xmlns:cx2="http://schemas.microsoft.com/office/drawing/2015/10/21/chartex" xmlns:cx3="http://schemas.microsoft.com/office/drawing/2016/5/9/chartex" xmlns:cx4="http://schemas.microsoft.com/office/drawing/2016/5/10/chartex" xmlns:cx5="http://schemas.microsoft.com/office/drawing/2016/5/11/chartex" xmlns:cx6="http://schemas.microsoft.com/office/drawing/2016/5/12/chartex" xmlns:cx7="http://schemas.microsoft.com/office/drawing/2016/5/13/chartex" xmlns:cx8="http://schemas.microsoft.com/office/drawing/2016/5/14/chartex" xmlns:mc="http://schemas.openxmlformats.org/markup-compatibility/2006" xmlns:aink="http://schemas.microsoft.com/office/drawing/2016/ink" xmlns:am3d="http://schemas.microsoft.com/office/drawing/2017/model3d" xmlns:o="urn:schemas-microsoft-com:office:office" xmlns:oel="http://schemas.microsoft.com/office/2019/extlst" xmlns:r="http://schemas.openxmlformats.org/officeDocument/2006/relationships" xmlns:m="http://schemas.openxmlformats.org/officeDocument/2006/math" xmlns:v="urn:schemas-microsoft-com:vml" xmlns:wp14="http://schemas.microsoft.com/office/word/2010/wordprocessingDrawing" xmlns:wp="http://schemas.openxmlformats.org/drawingml/2006/wordprocessingDrawing" xmlns:w10="urn:schemas-microsoft-com:office:word" xmlns:w="http://schemas.openxmlformats.org/wordprocessingml/2006/main" xmlns:w14="http://schemas.microsoft.com/office/word/2010/wordml" xmlns:w15="http://schemas.microsoft.com/office/word/2012/wordml" xmlns:w16cex="http://schemas.microsoft.com/office/word/2018/wordml/cex" xmlns:w16cid="http://schemas.microsoft.com/office/word/2016/wordml/cid" xmlns:w16="http://schemas.microsoft.com/office/word/2018/wordml" xmlns:w16du="http://schemas.microsoft.com/office/word/2023/wordml/word16du" xmlns:w16sdtdh="http://schemas.microsoft.com/office/word/2020/wordml/sdtdatahash" xmlns:w16sdtfl="http://schemas.microsoft.com/office/word/2024/wordml/sdtformatlock" xmlns:w16se="http://schemas.microsoft.com/office/word/2015/wordml/symex" xmlns:wpg="http://schemas.microsoft.com/office/word/2010/wordprocessingGroup" xmlns:wpi="http://schemas.microsoft.com/office/word/2010/wordprocessingInk" xmlns:wne="http://schemas.microsoft.com/office/word/2006/wordml" xmlns:wps="http://schemas.microsoft.com/office/word/2010/wordprocessingShape" mc:Ignorable="w14 w15 w16se w16cid w16 w16cex w16sdtdh w16sdtfl w16du wp14">
+<w:numbering xmlns:wpc="http://schemas.microsoft.com/office/word/2010/wordprocessingCanvas" xmlns:cx="http://schemas.microsoft.com/office/drawing/2014/chartex" xmlns:cx1="http://schemas.microsoft.com/office/drawing/2015/9/8/chartex" xmlns:cx2="http://schemas.microsoft.com/office/drawing/2015/10/21/chartex" xmlns:cx3="http://schemas.microsoft.com/office/drawing/2016/5/9/chartex" xmlns:cx4="http://schemas.microsoft.com/office/drawing/2016/5/10/chartex" xmlns:cx5="http://schemas.microsoft.com/office/drawing/2016/5/11/chartex" xmlns:cx6="http://schemas.microsoft.com/office/drawing/2016/5/12/chartex" xmlns:cx7="http://schemas.microsoft.com/office/drawing/2016/5/13/chartex" xmlns:cx8="http://schemas.microsoft.com/office/drawing/2016/5/14/chartex" xmlns:mc="http://schemas.openxmlformats.org/markup-compatibility/2006" xmlns:m="http://schemas.openxmlformats.org/officeDocument/2006/math" xmlns:aink="http://schemas.microsoft.com/office/drawing/2016/ink" xmlns:am3d="http://schemas.microsoft.com/office/drawing/2017/model3d" xmlns:oel="http://schemas.microsoft.com/office/2019/extlst" xmlns:r="http://schemas.openxmlformats.org/officeDocument/2006/relationships" xmlns:wp14="http://schemas.microsoft.com/office/word/2010/wordprocessingDrawing" xmlns:wp="http://schemas.openxmlformats.org/drawingml/2006/wordprocessingDrawing" xmlns:wpg="http://schemas.microsoft.com/office/word/2010/wordprocessingGroup" xmlns:wpi="http://schemas.microsoft.com/office/word/2010/wordprocessingInk" xmlns:wps="http://schemas.microsoft.com/office/word/2010/wordprocessingShape" xmlns:o="urn:schemas-microsoft-com:office:office" xmlns:v="urn:schemas-microsoft-com:vml" xmlns:w10="urn:schemas-microsoft-com:office:word" xmlns:w="http://schemas.openxmlformats.org/wordprocessingml/2006/main" xmlns:w14="http://schemas.microsoft.com/office/word/2010/wordml" xmlns:w15="http://schemas.microsoft.com/office/word/2012/wordml" xmlns:w16cei="http://schemas.microsoft.com/office/word/2026/wordml/cei" xmlns:w16cex="http://schemas.microsoft.com/office/word/2018/wordml/cex" xmlns:w16cid="http://schemas.microsoft.com/office/word/2016/wordml/cid" xmlns:w16="http://schemas.microsoft.com/office/word/2018/wordml" xmlns:w16sdtdh="http://schemas.microsoft.com/office/word/2020/wordml/sdtdatahash" xmlns:w16sdtfl="http://schemas.microsoft.com/office/word/2024/wordml/sdtformatlock" xmlns:w16se="http://schemas.microsoft.com/office/word/2015/wordml/symex" xmlns:w16du="http://schemas.microsoft.com/office/word/2023/wordml/word16du" xmlns:wne="http://schemas.microsoft.com/office/word/2006/wordml" mc:Ignorable="w14 w15 w16se w16cid w16 w16cex w16sdtdh w16sdtfl w16du wp14">
   <w:abstractNum w:abstractNumId="0" w15:restartNumberingAfterBreak="0">
     <w:nsid w:val="58A445F5"/>
     <w:multiLevelType w:val="hybridMultilevel"/>
@@ -2228,7 +2262,7 @@
 </file>
 
 <file path=word/styles.xml><?xml version="1.0" encoding="utf-8"?>
-<w:styles xmlns:mc="http://schemas.openxmlformats.org/markup-compatibility/2006" xmlns:r="http://schemas.openxmlformats.org/officeDocument/2006/relationships" xmlns:w="http://schemas.openxmlformats.org/wordprocessingml/2006/main" xmlns:w14="http://schemas.microsoft.com/office/word/2010/wordml" xmlns:w15="http://schemas.microsoft.com/office/word/2012/wordml" xmlns:w16cex="http://schemas.microsoft.com/office/word/2018/wordml/cex" xmlns:w16cid="http://schemas.microsoft.com/office/word/2016/wordml/cid" xmlns:w16="http://schemas.microsoft.com/office/word/2018/wordml" xmlns:w16du="http://schemas.microsoft.com/office/word/2023/wordml/word16du" xmlns:w16sdtdh="http://schemas.microsoft.com/office/word/2020/wordml/sdtdatahash" xmlns:w16sdtfl="http://schemas.microsoft.com/office/word/2024/wordml/sdtformatlock" xmlns:w16se="http://schemas.microsoft.com/office/word/2015/wordml/symex" mc:Ignorable="w14 w15 w16se w16cid w16 w16cex w16sdtdh w16sdtfl w16du">
+<w:styles xmlns:mc="http://schemas.openxmlformats.org/markup-compatibility/2006" xmlns:r="http://schemas.openxmlformats.org/officeDocument/2006/relationships" xmlns:w="http://schemas.openxmlformats.org/wordprocessingml/2006/main" xmlns:w14="http://schemas.microsoft.com/office/word/2010/wordml" xmlns:w15="http://schemas.microsoft.com/office/word/2012/wordml" xmlns:w16cex="http://schemas.microsoft.com/office/word/2018/wordml/cex" xmlns:w16cid="http://schemas.microsoft.com/office/word/2016/wordml/cid" xmlns:w16="http://schemas.microsoft.com/office/word/2018/wordml" xmlns:w16sdtdh="http://schemas.microsoft.com/office/word/2020/wordml/sdtdatahash" xmlns:w16sdtfl="http://schemas.microsoft.com/office/word/2024/wordml/sdtformatlock" xmlns:w16se="http://schemas.microsoft.com/office/word/2015/wordml/symex" xmlns:w16du="http://schemas.microsoft.com/office/word/2023/wordml/word16du" mc:Ignorable="w14 w15 w16se w16cid w16 w16cex w16sdtdh w16sdtfl w16du">
   <w:docDefaults>
     <w:rPrDefault>
       <w:rPr>
@@ -2840,7 +2874,6 @@
   <w:style w:type="character" w:default="1" w:styleId="DefaultParagraphFont">
     <w:name w:val="Default Paragraph Font"/>
     <w:uiPriority w:val="1"/>
-    <w:semiHidden/>
     <w:unhideWhenUsed/>
   </w:style>
   <w:style w:type="table" w:default="1" w:styleId="TableNormal">

</xml_diff>

<commit_message>
Sync the grading tab with the corrected policy document
The source document now reads "Below 60% = F", matching the site, and no
longer assigns 100 pts to each assessment category. The point values are
removed from the site so the two agree, and the archived copy in docs/ is
refreshed.

Co-Authored-By: Claude Opus 5 <noreply@anthropic.com>
</commit_message>
<xml_diff>
--- a/docs/Syllabus Policy.docx
+++ b/docs/Syllabus Policy.docx
@@ -918,13 +918,8 @@
         </w:rPr>
       </w:pPr>
       <w:r>
-        <w:rPr>
-          <w:noProof/>
-        </w:rPr>
-      </w:r>
-      <w:r>
-        <w:pict w14:anchorId="6734B46C">
-          <v:rect id="Horizontal Line 1" o:spid="_x0000_s1026" style="width:451.6pt;height:.05pt;visibility:visible;mso-wrap-style:square;mso-left-percent:-10001;mso-top-percent:-10001;mso-position-horizontal:absolute;mso-position-horizontal-relative:char;mso-position-vertical:absolute;mso-position-vertical-relative:line;mso-left-percent:-10001;mso-top-percent:-10001;v-text-anchor:top" o:gfxdata="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" filled="f">
+        <w:pict w14:anchorId="5E182446">
+          <v:rect id="Horizontal Line 1" o:spid="_x0000_s1026" alt="" style="width:451.6pt;height:.05pt;visibility:visible;mso-wrap-style:square;mso-width-percent:0;mso-height-percent:0;mso-left-percent:-10001;mso-top-percent:-10001;mso-position-horizontal:absolute;mso-position-horizontal-relative:char;mso-position-vertical:absolute;mso-position-vertical-relative:line;mso-width-percent:0;mso-height-percent:0;mso-left-percent:-10001;mso-top-percent:-10001;v-text-anchor:top" filled="f">
             <o:lock v:ext="edit" rotation="t" aspectratio="t" verticies="t" text="t" shapetype="t"/>
             <w10:anchorlock/>
           </v:rect>
@@ -2106,8 +2101,21 @@
     </w:p>
     <w:p>
       <w:r>
+        <w:t>Below 60%</w:t>
+      </w:r>
+      <w:r>
+        <w:t xml:space="preserve"> = F </w:t>
+      </w:r>
+    </w:p>
+    <w:p>
+      <w:r>
         <w:lastRenderedPageBreak/>
-        <w:t>50-59% = F Assessments = 100% · Presentations 100 pts · Written Assignments 100 pts · Student Profile Portfolio 100pts </w:t>
+        <w:t xml:space="preserve">Assessments = 100% </w:t>
+      </w:r>
+    </w:p>
+    <w:p>
+      <w:r>
+        <w:t xml:space="preserve">· Presentations · Written Assignments · Student Profile Portfolio </w:t>
       </w:r>
     </w:p>
     <w:p>
@@ -2874,6 +2882,7 @@
   <w:style w:type="character" w:default="1" w:styleId="DefaultParagraphFont">
     <w:name w:val="Default Paragraph Font"/>
     <w:uiPriority w:val="1"/>
+    <w:semiHidden/>
     <w:unhideWhenUsed/>
   </w:style>
   <w:style w:type="table" w:default="1" w:styleId="TableNormal">

</xml_diff>